<commit_message>
Add five generated figures, embed in HTML report, reference in manuscript draft
Co-Authored-By: Claude Sonnet 5.5 <noreply@anthropic.com>
Claude-Session: https://claude.ai/code/session_014MhMGnb8qDcM9MkpTmcbeG
</commit_message>
<xml_diff>
--- a/legal-last-mile-systematic-review/07_manuscript/draft/MANUSCRIPT_DRAFT_2026-10-04.docx
+++ b/legal-last-mile-systematic-review/07_manuscript/draft/MANUSCRIPT_DRAFT_2026-10-04.docx
@@ -1147,6 +1147,136 @@
       </w:pPr>
       <w:r>
         <w:t xml:space="preserve">3.2 Characteristics of the included evidence</w:t>
+      </w:r>
+    </w:p>
+    <w:p>
+      <w:pPr>
+        <w:pStyle w:val="FirstParagraph"/>
+      </w:pPr>
+      <w:r>
+        <w:rPr>
+          <w:iCs/>
+          <w:i/>
+        </w:rPr>
+        <w:t xml:space="preserve">Figures 1–3 and 5 (</w:t>
+      </w:r>
+      <w:r>
+        <w:rPr>
+          <w:rStyle w:val="VerbatimChar"/>
+          <w:iCs/>
+          <w:i/>
+        </w:rPr>
+        <w:t xml:space="preserve">06_outputs/figures/fig1_design_mix.svg</w:t>
+      </w:r>
+      <w:r>
+        <w:rPr>
+          <w:iCs/>
+          <w:i/>
+        </w:rPr>
+        <w:t xml:space="preserve">,</w:t>
+      </w:r>
+      <w:r>
+        <w:rPr>
+          <w:iCs/>
+          <w:i/>
+        </w:rPr>
+        <w:t xml:space="preserve"> </w:t>
+      </w:r>
+      <w:r>
+        <w:rPr>
+          <w:rStyle w:val="VerbatimChar"/>
+          <w:iCs/>
+          <w:i/>
+        </w:rPr>
+        <w:t xml:space="preserve">fig2_publication_years.svg</w:t>
+      </w:r>
+      <w:r>
+        <w:rPr>
+          <w:iCs/>
+          <w:i/>
+        </w:rPr>
+        <w:t xml:space="preserve">,</w:t>
+      </w:r>
+      <w:r>
+        <w:rPr>
+          <w:iCs/>
+          <w:i/>
+        </w:rPr>
+        <w:t xml:space="preserve"> </w:t>
+      </w:r>
+      <w:r>
+        <w:rPr>
+          <w:rStyle w:val="VerbatimChar"/>
+          <w:iCs/>
+          <w:i/>
+        </w:rPr>
+        <w:t xml:space="preserve">fig3_countries.svg</w:t>
+      </w:r>
+      <w:r>
+        <w:rPr>
+          <w:iCs/>
+          <w:i/>
+        </w:rPr>
+        <w:t xml:space="preserve">,</w:t>
+      </w:r>
+      <w:r>
+        <w:rPr>
+          <w:iCs/>
+          <w:i/>
+        </w:rPr>
+        <w:t xml:space="preserve"> </w:t>
+      </w:r>
+      <w:r>
+        <w:rPr>
+          <w:rStyle w:val="VerbatimChar"/>
+          <w:iCs/>
+          <w:i/>
+        </w:rPr>
+        <w:t xml:space="preserve">fig5_appraisal_tools.svg</w:t>
+      </w:r>
+      <w:r>
+        <w:rPr>
+          <w:iCs/>
+          <w:i/>
+        </w:rPr>
+        <w:t xml:space="preserve">) show the design mix, publication years, countries and appraisal instruments; Figure 4 (</w:t>
+      </w:r>
+      <w:r>
+        <w:rPr>
+          <w:rStyle w:val="VerbatimChar"/>
+          <w:iCs/>
+          <w:i/>
+        </w:rPr>
+        <w:t xml:space="preserve">fig4_direction_by_family.svg</w:t>
+      </w:r>
+      <w:r>
+        <w:rPr>
+          <w:iCs/>
+          <w:i/>
+        </w:rPr>
+        <w:t xml:space="preserve">) shows the direction of association in the three syntheses (Section 3.5). All are generated from the databases by</w:t>
+      </w:r>
+      <w:r>
+        <w:rPr>
+          <w:iCs/>
+          <w:i/>
+        </w:rPr>
+        <w:t xml:space="preserve"> </w:t>
+      </w:r>
+      <w:r>
+        <w:rPr>
+          <w:rStyle w:val="VerbatimChar"/>
+          <w:iCs/>
+          <w:i/>
+        </w:rPr>
+        <w:t xml:space="preserve">code/analysis/build_figures.py</w:t>
+      </w:r>
+      <w:r>
+        <w:rPr>
+          <w:iCs/>
+          <w:i/>
+        </w:rPr>
+        <w:t xml:space="preserve">.</w:t>
       </w:r>
     </w:p>
     <w:p>

</xml_diff>

<commit_message>
Manuscript: report AI re-read of 72 studies and material-correction count (computed from campaign JSONs)
Co-Authored-By: Claude Sonnet 5.5 <noreply@anthropic.com>
Claude-Session: https://claude.ai/code/session_014MhMGnb8qDcM9MkpTmcbeG
</commit_message>
<xml_diff>
--- a/legal-last-mile-systematic-review/07_manuscript/draft/MANUSCRIPT_DRAFT_2026-10-04.docx
+++ b/legal-last-mile-systematic-review/07_manuscript/draft/MANUSCRIPT_DRAFT_2026-10-04.docx
@@ -441,7 +441,16 @@
         <w:t xml:space="preserve">CODEBOOK.md</w:t>
       </w:r>
       <w:r>
-        <w:t xml:space="preserve">) was completed for every included study by the AI, largely from full text; 37 studies were extracted from abstract or metadata only and an audit found further rows with signs of shallow extraction (Limitations). There was no second extractor. A seeded sample for human second extraction has been prepared (</w:t>
+        <w:t xml:space="preserve">) was completed for every included study by the AI, largely from full text; 37 studies were extracted from abstract or metadata only and an audit found further rows with signs of shallow extraction (Limitations). The AI later re-read 72 studies from full texts found in the researcher’s Drive; of the 47 rows flagged only by the sparse-record audit, 2 had an abstract-level extraction that was materially wrong or incomplete (</w:t>
+      </w:r>
+      <w:r>
+        <w:rPr>
+          <w:rStyle w:val="VerbatimChar"/>
+        </w:rPr>
+        <w:t xml:space="preserve">reextract_2026-10-04/CAMPAIGN_NOTES.md</w:t>
+      </w:r>
+      <w:r>
+        <w:t xml:space="preserve">). There was no second extractor. A seeded sample for human second extraction has been prepared (</w:t>
       </w:r>
       <w:r>
         <w:rPr>
@@ -4157,7 +4166,16 @@
         <w:t xml:space="preserve"> </w:t>
       </w:r>
       <w:r>
-        <w:t xml:space="preserve">37 studies were extracted from abstract or metadata only; there was no second extractor.</w:t>
+        <w:t xml:space="preserve">37 studies were extracted from abstract or metadata only; there was no second extractor. The AI re-read 72 studies from full texts after the first extraction (an AI check of AI work, not independent verification); in 2 of the 47 sparse-audit rows among them the abstract-level extraction was materially wrong or incomplete (</w:t>
+      </w:r>
+      <w:r>
+        <w:rPr>
+          <w:rStyle w:val="VerbatimChar"/>
+        </w:rPr>
+        <w:t xml:space="preserve">CAMPAIGN_NOTES.md</w:t>
+      </w:r>
+      <w:r>
+        <w:t xml:space="preserve">).</w:t>
       </w:r>
     </w:p>
     <w:p>

</xml_diff>

<commit_message>
A16: Claude triage of the disagreements (N/B/X) and projections under narrow and literal readings (about 206 / 401 implied includes)
Co-Authored-By: Claude Opus 5.5 <noreply@anthropic.com>
Claude-Session: https://claude.ai/code/session_014MhMGnb8qDcM9MkpTmcbeG
</commit_message>
<xml_diff>
--- a/legal-last-mile-systematic-review/07_manuscript/draft/MANUSCRIPT_DRAFT_2026-10-04.docx
+++ b/legal-last-mile-systematic-review/07_manuscript/draft/MANUSCRIPT_DRAFT_2026-10-04.docx
@@ -4144,7 +4144,7 @@
         <w:t xml:space="preserve"> </w:t>
       </w:r>
       <w:r>
-        <w:t xml:space="preserve">Screening decisions, extraction, appraisal and coding of direction of association were made by the same AI system; only 200 full-text includes were human-confirmed, 73 decided rows carry no recorded reviewer, and the title/abstract exclusions were not human-checked. A blind re-read by two non-Claude models (Codex, Gemini) of 70 of the AI’s full-text excludes (a stratified sample, limited to records whose PDF was available) judged 34 of them to be includes; this is an AI-versus-AI check, it was not human-adjudicated, and, scaled by exclusion code, the rate would imply roughly 468 further includes if the models were right (arithmetic only), so the exclusion log may understate the eligible literature substantially (open item A16;</w:t>
+        <w:t xml:space="preserve">Screening decisions, extraction, appraisal and coding of direction of association were made by the same AI system; only 200 full-text includes were human-confirmed, 73 decided rows carry no recorded reviewer, and the title/abstract exclusions were not human-checked. A blind re-read by two non-Claude models (Codex, Gemini) of 70 of the AI’s full-text excludes (a stratified sample, limited to records whose PDF was available) judged 34 of them to be includes; this is an AI-versus-AI check, it was not human-adjudicated, and, scaled by exclusion code, the rate would imply roughly 468 further includes if the models were right, and an AI triage of the same records puts about 206 under a narrow reading of the criteria (arithmetic only), so the exclusion log may understate the eligible literature substantially (open item A16;</w:t>
       </w:r>
       <w:r>
         <w:t xml:space="preserve"> </w:t>
@@ -4452,7 +4452,7 @@
         <w:t xml:space="preserve"> </w:t>
       </w:r>
       <w:r>
-        <w:t xml:space="preserve">Two non-Claude models (Codex, Gemini), blind to the original decision, re-read 99 full-text decisions whose PDF was available; of the 70 the AI had excluded, 34 were judged includes (concentrated in E01 wrong topic and E06 engineering only). This was not human-adjudicated, the models may read the criteria too loosely, and nothing was changed; scaled by exclusion code the rate would imply roughly 468 further includes if the models were right (arithmetic only, against 1,159 current includes); if even a fraction are eligible, the exclusion log and every count built on it are understated. The researcher’s reading list is</w:t>
+        <w:t xml:space="preserve">Two non-Claude models (Codex, Gemini), blind to the original decision, re-read 99 full-text decisions whose PDF was available; of the 70 the AI had excluded, 34 were judged includes (concentrated in E01 wrong topic and E06 engineering only). This was not human-adjudicated, the models may read the criteria too loosely, and nothing was changed; scaled by exclusion code the rate would imply roughly 468 further includes if the models were right, and about 206 even under a narrow reading of criterion 2 by an AI triage of the same records (arithmetic only, against 1,159 current includes); if even a fraction are eligible, the exclusion log and every count built on it are understated. The researcher’s reading list is</w:t>
       </w:r>
       <w:r>
         <w:t xml:space="preserve"> </w:t>

</xml_diff>

<commit_message>
A16: abstract checks of the 15 narrow-reading candidates (7 hold); revised projections 104 narrow / 366 literal
Co-Authored-By: Claude Opus 5.5 <noreply@anthropic.com>
Claude-Session: https://claude.ai/code/session_014MhMGnb8qDcM9MkpTmcbeG
</commit_message>
<xml_diff>
--- a/legal-last-mile-systematic-review/07_manuscript/draft/MANUSCRIPT_DRAFT_2026-10-04.docx
+++ b/legal-last-mile-systematic-review/07_manuscript/draft/MANUSCRIPT_DRAFT_2026-10-04.docx
@@ -4144,7 +4144,7 @@
         <w:t xml:space="preserve"> </w:t>
       </w:r>
       <w:r>
-        <w:t xml:space="preserve">Screening decisions, extraction, appraisal and coding of direction of association were made by the same AI system; only 200 full-text includes were human-confirmed, 73 decided rows carry no recorded reviewer, and the title/abstract exclusions were not human-checked. A blind re-read by two non-Claude models (Codex, Gemini) of 70 of the AI’s full-text excludes (a stratified sample, limited to records whose PDF was available) judged 34 of them to be includes; this is an AI-versus-AI check, it was not human-adjudicated, and, scaled by exclusion code, the rate would imply roughly 468 further includes if the models were right, and an AI triage of the same records puts about 206 under a narrow reading of the criteria (arithmetic only), so the exclusion log may understate the eligible literature substantially (open item A16;</w:t>
+        <w:t xml:space="preserve">Screening decisions, extraction, appraisal and coding of direction of association were made by the same AI system; only 200 full-text includes were human-confirmed, 73 decided rows carry no recorded reviewer, and the title/abstract exclusions were not human-checked. A blind re-read by two non-Claude models (Codex, Gemini) of 70 of the AI’s full-text excludes (a stratified sample, limited to records whose PDF was available) judged 34 of them to be includes; this is an AI-versus-AI check, it was not human-adjudicated, and, scaled by exclusion code, the rate would imply roughly 468 further includes if the models were right, and an AI triage of the same records puts about 104 under a narrow reading of the criteria (arithmetic only), so the exclusion log may understate the eligible literature substantially (open item A16;</w:t>
       </w:r>
       <w:r>
         <w:t xml:space="preserve"> </w:t>
@@ -4452,7 +4452,7 @@
         <w:t xml:space="preserve"> </w:t>
       </w:r>
       <w:r>
-        <w:t xml:space="preserve">Two non-Claude models (Codex, Gemini), blind to the original decision, re-read 99 full-text decisions whose PDF was available; of the 70 the AI had excluded, 34 were judged includes (concentrated in E01 wrong topic and E06 engineering only). This was not human-adjudicated, the models may read the criteria too loosely, and nothing was changed; scaled by exclusion code the rate would imply roughly 468 further includes if the models were right, and about 206 even under a narrow reading of criterion 2 by an AI triage of the same records (arithmetic only, against 1,159 current includes); if even a fraction are eligible, the exclusion log and every count built on it are understated. The researcher’s reading list is</w:t>
+        <w:t xml:space="preserve">Two non-Claude models (Codex, Gemini), blind to the original decision, re-read 99 full-text decisions whose PDF was available; of the 70 the AI had excluded, 34 were judged includes (concentrated in E01 wrong topic and E06 engineering only). This was not human-adjudicated, the models may read the criteria too loosely, and nothing was changed; scaled by exclusion code the rate would imply roughly 468 further includes if the models were right, and about 104 even under a narrow reading of criterion 2 by an AI triage of the same records (arithmetic only, against 1,159 current includes); if even a fraction are eligible, the exclusion log and every count built on it are understated. The researcher’s reading list is</w:t>
       </w:r>
       <w:r>
         <w:t xml:space="preserve"> </w:t>

</xml_diff>

<commit_message>
A16: includes-side projection (3 of 18 sampled includes look excludable, about 160 of 959) and triage of the priority-4 rows
Co-Authored-By: Claude Opus 5.5 <noreply@anthropic.com>
Claude-Session: https://claude.ai/code/session_014MhMGnb8qDcM9MkpTmcbeG
</commit_message>
<xml_diff>
--- a/legal-last-mile-systematic-review/07_manuscript/draft/MANUSCRIPT_DRAFT_2026-10-04.docx
+++ b/legal-last-mile-systematic-review/07_manuscript/draft/MANUSCRIPT_DRAFT_2026-10-04.docx
@@ -4144,7 +4144,7 @@
         <w:t xml:space="preserve"> </w:t>
       </w:r>
       <w:r>
-        <w:t xml:space="preserve">Screening decisions, extraction, appraisal and coding of direction of association were made by the same AI system; only 200 full-text includes were human-confirmed, 73 decided rows carry no recorded reviewer, and the title/abstract exclusions were not human-checked. A blind re-read by two non-Claude models (Codex, Gemini) of 70 of the AI’s full-text excludes (a stratified sample, limited to records whose PDF was available) judged 34 of them to be includes; this is an AI-versus-AI check, it was not human-adjudicated, and, scaled by exclusion code, the rate would imply roughly 468 further includes if the models were right, and an AI triage of the same records puts about 104 under a narrow reading of the criteria (arithmetic only), so the exclusion log may understate the eligible literature substantially (open item A16;</w:t>
+        <w:t xml:space="preserve">Screening decisions, extraction, appraisal and coding of direction of association were made by the same AI system; only 200 full-text includes were human-confirmed, 73 decided rows carry no recorded reviewer, and the title/abstract exclusions were not human-checked. A blind re-read by two non-Claude models (Codex, Gemini) of 70 of the AI’s full-text excludes (a stratified sample, limited to records whose PDF was available) judged 34 of them to be includes; this is an AI-versus-AI check, it was not human-adjudicated, and, scaled by exclusion code, the rate would imply roughly 468 further includes if the models were right, and an AI triage of the same records puts about 104 under a narrow reading of the criteria (arithmetic only), so the exclusion log may understate the eligible literature substantially; in the other direction, the models would exclude 3 of 18 sampled unconfirmed includes, roughly 160 of the unconfirmed includes if the rate held (open item A16;</w:t>
       </w:r>
       <w:r>
         <w:t xml:space="preserve"> </w:t>
@@ -4452,7 +4452,7 @@
         <w:t xml:space="preserve"> </w:t>
       </w:r>
       <w:r>
-        <w:t xml:space="preserve">Two non-Claude models (Codex, Gemini), blind to the original decision, re-read 99 full-text decisions whose PDF was available; of the 70 the AI had excluded, 34 were judged includes (concentrated in E01 wrong topic and E06 engineering only). This was not human-adjudicated, the models may read the criteria too loosely, and nothing was changed; scaled by exclusion code the rate would imply roughly 468 further includes if the models were right, and about 104 even under a narrow reading of criterion 2 by an AI triage of the same records (arithmetic only, against 1,159 current includes); if even a fraction are eligible, the exclusion log and every count built on it are understated. The researcher’s reading list is</w:t>
+        <w:t xml:space="preserve">Two non-Claude models (Codex, Gemini), blind to the original decision, re-read 99 full-text decisions whose PDF was available; of the 70 the AI had excluded, 34 were judged includes (concentrated in E01 wrong topic and E06 engineering only). This was not human-adjudicated, the models may read the criteria too loosely, and nothing was changed; scaled by exclusion code the rate would imply roughly 468 further includes if the models were right, and about 104 even under a narrow reading of criterion 2 by an AI triage of the same records (arithmetic only, against 1,159 current includes); if even a fraction are eligible, the exclusion log and every count built on it are understated. In the other direction the models would exclude 3 of 18 sampled includes beyond S001–S200, roughly 160 (range 56–376) of the unconfirmed includes if the rate held — a precision question that the human second-screening of includes would settle. The researcher’s reading list is</w:t>
       </w:r>
       <w:r>
         <w:t xml:space="preserve"> </w:t>

</xml_diff>

<commit_message>
Move the 0.2.0-interim freeze to the complete post-A13/A14/A8 state; 14 standard CRediT roles; Gemini free-tier cost note; A6 tier-1 CK sheet
- A13: S331 confirmed as a reasoned non-fit (60 effect rows; A 18, B 6, C 20; 16 non-fits).
- A8: author contributions now the 14 standard NISO CRediT roles; cost sentence names the Gemini free-tier API key (manuscript generator, disclosure file, PRISMA checklist, OSF fields, AI-use statement).
- Release: osf_preregistration_draft.md and RELEASE_0.2.0-interim_2026-10-14.md freeze the later state; ledger, handoff and CHANGELOG updated.
- A6: CK ruling sheet (CSV and Markdown) for the 18 tier-1 rows with a blind Codex and Gemini decision, built by a read-only dated script.
- Regenerated all derived files and the manuscript draft (Markdown and Word); 181 verifier checks pass.

Co-Authored-By: Claude Sonnet 5.5 <noreply@anthropic.com>
Claude-Session: https://claude.ai/code/session_014MhMGnb8qDcM9MkpTmcbeG
</commit_message>
<xml_diff>
--- a/legal-last-mile-systematic-review/07_manuscript/draft/MANUSCRIPT_DRAFT_2026-10-04.docx
+++ b/legal-last-mile-systematic-review/07_manuscript/draft/MANUSCRIPT_DRAFT_2026-10-04.docx
@@ -5196,7 +5196,16 @@
         <w:t xml:space="preserve"> </w:t>
       </w:r>
       <w:r>
-        <w:t xml:space="preserve">This research received no specific grant from any funding agency in the public, commercial, or not-for-profit sectors. Database access was provided through institutional subscriptions at Erasmus University Rotterdam. API and subscription costs for the AI tools used in this review (Anthropic Claude, OpenAI Codex and Google Gemini) were paid personally by the author; no external, institutional or vendor funding was received.</w:t>
+        <w:t xml:space="preserve">This research received no specific grant from any funding agency in the public, commercial, or not-for-profit sectors. Database access was provided through institutional subscriptions at Erasmus University Rotterdam. API and subscription costs for Anthropic Claude and OpenAI Codex were paid personally by the author, and Google Gemini runs (</w:t>
+      </w:r>
+      <w:r>
+        <w:rPr>
+          <w:rStyle w:val="VerbatimChar"/>
+        </w:rPr>
+        <w:t xml:space="preserve">gemini-3.1-flash-lite</w:t>
+      </w:r>
+      <w:r>
+        <w:t xml:space="preserve">) used the author’s free-tier API key; no external, institutional, or vendor funding was received.</w:t>
       </w:r>
     </w:p>
     <w:p>
@@ -5512,16 +5521,7 @@
         <w:t xml:space="preserve"> </w:t>
       </w:r>
       <w:r>
-        <w:t xml:space="preserve">Claudio Klaus: Conceptualization, Methodology, Protocol &amp; Codebook Design, Database Search Execution, Title/Abstract Second Review, Full-Text Adjudication &amp; Verification (</w:t>
-      </w:r>
-      <w:r>
-        <w:rPr>
-          <w:rStyle w:val="VerbatimChar"/>
-        </w:rPr>
-        <w:t xml:space="preserve">reviewer_2</w:t>
-      </w:r>
-      <w:r>
-        <w:t xml:space="preserve">), Software &amp; Validation Oversight, Writing – Review &amp; Editing, Supervision, Project Administration. The AI-assisted first-pass screening, data extraction, batch appraisal and preliminary synthesis drafting were carried out by AI tools under the author’s direction and are described in</w:t>
+        <w:t xml:space="preserve">Claudio Klaus: Conceptualization, Data curation, Formal analysis, Funding acquisition (self-funded), Investigation, Methodology, Project administration, Resources, Software, Supervision, Validation, Visualization, Writing – original draft (direction and revision of AI-assisted synthesis; see AI_USE_STATEMENT.md), Writing – review &amp; editing. The AI tools used (Anthropic Claude, OpenAI Codex, Google Gemini) are not authors; the AI-assisted stages are described in</w:t>
       </w:r>
       <w:r>
         <w:t xml:space="preserve"> </w:t>
@@ -5533,7 +5533,7 @@
         <w:t xml:space="preserve">AI_USE_STATEMENT.md</w:t>
       </w:r>
       <w:r>
-        <w:t xml:space="preserve">; the AI tools are not authors.</w:t>
+        <w:t xml:space="preserve">.</w:t>
       </w:r>
     </w:p>
     <w:p>

</xml_diff>

<commit_message>
A6 tier 1: confirm S391, S395 and batch 2 (20 includes) under CK with ten borderline-include notes; polish Abstract and Methods
- Dated A6 notes on 22 rows (no decision, label, count or family changed; S366 stays alongside S294); ten recorded as BORDERLINE INCLUDE with the reason and counted as a computed figure.
- Human verification is 197 confirmed + 214 ruled on = 411 of 2,277 (18.1%); the verifier now checks that the OSF draft, release note, queue README and AI-use statement quote the computed numbers.
- Manuscript draft: one-sentence Background, "the author" wording in the Results and Methods 2.2, 2.3 and 2.6, the PI's Conclusions prose, the 2.2 pass list "A6, A16, A19, and A22 to A25", and a stale sensitivity-analysis sentence corrected.
- Batch sheet for the remaining 34 tier-1 rows rebuilt to show the full Pass-1 rationale. 185 verifier checks pass.

Co-Authored-By: Claude Sonnet 5.5 <noreply@anthropic.com>
Claude-Session: https://claude.ai/code/session_014MhMGnb8qDcM9MkpTmcbeG
</commit_message>
<xml_diff>
--- a/legal-last-mile-systematic-review/07_manuscript/draft/MANUSCRIPT_DRAFT_2026-10-04.docx
+++ b/legal-last-mile-systematic-review/07_manuscript/draft/MANUSCRIPT_DRAFT_2026-10-04.docx
@@ -93,7 +93,7 @@
         <w:t xml:space="preserve"> </w:t>
       </w:r>
       <w:r>
-        <w:t xml:space="preserve">Physical water and sanitation infrastructure does not guarantee that households can obtain a connection or use it effectively; legal and administrative conditions (eligibility screening, documentation and tenure requirements, fees, discretion, enforcement) may stand between infrastructure and access. Physical expansion of water and sanitation networks does not automatically translate into effective household access where legal, regulatory, and administrative rules governing eligibility, tenure, tariffs, discretion, and enforcement operate as barriers at the</w:t>
+        <w:t xml:space="preserve">Physical expansion of water and sanitation infrastructure does not automatically guarantee household connection or effective use where legal, regulatory, and administrative conditions—such as eligibility screening, tenure and documentation rules, tariffs, bureaucratic discretion, and enforcement—operate as barriers at the</w:t>
       </w:r>
       <w:r>
         <w:t xml:space="preserve"> </w:t>
@@ -159,7 +159,7 @@
         <w:t xml:space="preserve"> </w:t>
       </w:r>
       <w:r>
-        <w:t xml:space="preserve">1,080 included reports (1,078 distinct studies; 85% since 2010) spanned many countries (India, Brazil, South Africa, the United States and Ghana the most frequent), but only 63 (6%) used designs able to support a causal claim. 60 studies had an extractable effect-size row; none could be pooled. In three SWiM families the direction of association was mostly favourable for legal-status, tenure and recognition mechanisms (Family A, k = 18), uniformly favourable or mixed for assistance, participation, trust and external-support mechanisms (Family B, k = 6), and without a dominant direction for ownership, regulation, institutional-capacity and administrative-structure mechanisms (Family C, k = 20); the families are thematic mechanism groupings, not homogeneous exposure–outcome pairs. A human has confirmed 197 full-text inclusions (S001–S200 net of 3 later retirements) and the researcher has adjudicated a further 192 full-text records (146 exclusions, 46 inclusions) in the scope, consistency and audit passes (A16, A19, A22–A25 and A6), so 389 of the 2,277 full-text decisions (17.1%) carry human verification or adjudication; no extracted value has been independently verified.</w:t>
+        <w:t xml:space="preserve">1,080 included reports (1,078 distinct studies; 85% since 2010) spanned many countries (India, Brazil, South Africa, the United States and Ghana the most frequent), but only 63 (6%) used designs able to support a causal claim. 60 studies had an extractable effect-size row; none could be pooled. In three SWiM families the direction of association was mostly favourable for legal-status, tenure and recognition mechanisms (Family A, k = 18), uniformly favourable or mixed for assistance, participation, trust and external-support mechanisms (Family B, k = 6), and without a dominant direction for ownership, regulation, institutional-capacity and administrative-structure mechanisms (Family C, k = 20); the families are thematic mechanism groupings, not homogeneous exposure–outcome pairs. The author independently confirmed 197 chronological full-text inclusions (S001–S200 net of 3 later retirements) and adjudicated a further 214 full-text records (146 exclusions, 68 inclusions) in the scope, consistency and audit passes (A6, A16, A19, A22–A25), so 411 of the 2,277 full-text decisions (18.1%) carry human verification or adjudication; no extracted value has been independently verified.</w:t>
       </w:r>
     </w:p>
     <w:p>
@@ -177,7 +177,7 @@
         <w:t xml:space="preserve"> </w:t>
       </w:r>
       <w:r>
-        <w:t xml:space="preserve">The literature documents associations between legal/administrative conditions and access across many settings far more often than it establishes causal effects; it does not support one pooled estimate. Confidence is low to very low for any causal or comparative claim. [Author to revise after human verification.]</w:t>
+        <w:t xml:space="preserve">The empirical literature extensively documents associations between legal and administrative conditions and household water and sanitation access across diverse institutional contexts, but rarely employs designs capable of isolating causal effects and does not support a single pooled meta-analytic estimate. Overall certainty for causal or cross-jurisdictional magnitude claims remains low to very low, underscoring the need for quasi-experimental and comparative socio-legal designs targeting specific administrative rules.</w:t>
       </w:r>
     </w:p>
     <w:p>
@@ -484,7 +484,7 @@
         <w:t xml:space="preserve"> </w:t>
       </w:r>
       <w:r>
-        <w:t xml:space="preserve">Criterion 2 is literally broad. After a blind re-read by two other AI models disagreed with about half of a sample of the AI’s full-text exclusions, the researcher ruled on 2026-10-13 that it would be applied as a legal or administrative access rule or mechanism (eligibility screening, administrative burden, documentation or tenure requirements, tariff or cost-recovery rules, discretion or accommodation, enforcement, or utility ownership or regulatory structure directly governing service access) rather than as project delivery, behavioural promotion or unanalysed macro-governance background, and to included and excluded studies alike. Because this was decided after the disagreement was seen, it is a post-hoc interpretive clarification of unchanged wording, not an a priori rule. It was followed on 2026-10-13 and 14 by consistency passes over the included studies (open items A16 and A22 to A25) applying criterion 3 (no primary data and no systematic method, code E05), criterion 4 (the outcome is not a household access outcome, E04) and the exposure test (E03); in these passes 83 included reports were moved to the exclusions and three exclusions to the inclusions. Eligibility never depends on the significance, magnitude or direction of a study’s estimate (clarification of 2026-10-14).</w:t>
+        <w:t xml:space="preserve">Criterion 2 is literally broad. After a blind re-read by two other AI models disagreed with about half of a sample of the AI’s full-text exclusions, the author ruled on 2026-10-13 that it would be applied as a legal or administrative access rule or mechanism (eligibility screening, administrative burden, documentation or tenure requirements, tariff or cost-recovery rules, discretion or accommodation, enforcement, or utility ownership or regulatory structure directly governing service access) rather than as project delivery, behavioural promotion or unanalysed macro-governance background, and to included and excluded studies alike. Because this was decided after the disagreement was seen, it is a post-hoc interpretive clarification of unchanged wording, not an a priori rule. It was followed on 2026-10-13 and 14 by consistency passes over the included studies (open items A6, A16, A19, and A22 to A25) applying criterion 3 (no primary data and no systematic method, code E05), criterion 4 (the outcome is not a household access outcome, E04) and the exposure test (E03); in these passes 83 included reports were moved to the exclusions and three exclusions to the inclusions. Eligibility never depends on the significance, magnitude or direction of a study’s estimate (clarification of 2026-10-14).</w:t>
       </w:r>
     </w:p>
     <w:bookmarkEnd w:id="24"/>
@@ -511,7 +511,7 @@
         <w:t xml:space="preserve">SEARCH_PROTOCOL.md</w:t>
       </w:r>
       <w:r>
-        <w:t xml:space="preserve">, README Known limitations). Selection was by an AI first pass (title/abstract and full text) with written rationales and standardised exclusion codes (E01–E12); a human second reviewer covered the 3,665 title/abstract records the AI marked include or unsure, and confirmed 197 of the 1,080 full-text includes; the researcher then adjudicated 192 further full-text decisions, so 389 of the 2,277 decisions (17.1%) carry human verification or adjudication. Full-text retrieval was closed by the researcher’s decision on 2026-09-28 with 1,382 title/abstract includes never assessed; the unassessed set is older on average (see 3.1). The 1,080 included items are reports, describing 1,078 distinct studies on the definite same-data links (1,076 counting the partial overlaps); no companion report was collapsed.</w:t>
+        <w:t xml:space="preserve">, README Known limitations). Selection was by an AI first pass (title/abstract and full text) with written rationales and standardised exclusion codes (E01–E12); the human reviewer (the author) covered the 3,665 title/abstract records the AI marked include or unsure, and confirmed 197 of the 1,080 full-text includes; the author then adjudicated 214 further full-text decisions, so 411 of the 2,277 decisions (18.1%) carry human verification or adjudication. Full-text retrieval was closed by the author’s decision on 2026-09-28 with 1,382 title/abstract includes never assessed; the unassessed set is older on average (see 3.1). The 1,080 included items are reports, describing 1,078 distinct studies on the definite same-data links (1,076 counting the partial overlaps); no companion report was collapsed.</w:t>
       </w:r>
     </w:p>
     <w:bookmarkEnd w:id="25"/>
@@ -644,7 +644,7 @@
         <w:t xml:space="preserve">multiple</w:t>
       </w:r>
       <w:r>
-        <w:t xml:space="preserve">; the families are not pooled with each other. The labels were mapped from the free-text labels of the extraction by keyword rules, with the rows the rules could not place resolved by the AI under the researcher’s review (four studies the mapping could not place were excluded), and the original labels are preserved; the mapping is mechanical and unvalidated, and a human has not checked it. Free-text study-design labels were mapped to the design list (eight values plus</w:t>
+        <w:t xml:space="preserve">; the families are not pooled with each other. The labels were mapped from the free-text labels of the extraction by keyword rules, with the rows the rules could not place resolved by the AI under the author’s review (four studies the mapping could not place were excluded), and the original labels are preserved; the mapping is mechanical and unvalidated, and a human has not checked it. Free-text study-design labels were mapped to the design list (eight values plus</w:t>
       </w:r>
       <w:r>
         <w:t xml:space="preserve"> </w:t>
@@ -674,7 +674,7 @@
         <w:t xml:space="preserve">05_analysis/effect_sizes/FAMILY_FIT_AUDIT_2026-10-04.md</w:t>
       </w:r>
       <w:r>
-        <w:t xml:space="preserve">), so the families are loose groupings, not tests of the specified constructs. Families A, B and C are therefore reported as thematic mechanism groupings used to organise structured vote counting (SWiM), not as homogeneous exposure–outcome pairs, and their headings describe the clusters actually synthesised (legal status, tenure, recognition and governance arrangements; assistance, participation, trust and external support; ownership, regulation, institutional capacity and administrative structure), which is also why pooling was rejected. No effect was converted to a common scale. Sensitivity analyses removed abstract-only and shallow extractions, the one row for a study not flagged eligible, linked reports and two coding judgment calls; they are reported as a supplementary table (</w:t>
+        <w:t xml:space="preserve">), so the families are loose groupings, not tests of the specified constructs. Families A, B and C are therefore reported as thematic mechanism groupings used to organise structured vote counting (SWiM), not as homogeneous exposure–outcome pairs, and their headings describe the clusters actually synthesised (legal status, tenure, recognition and governance arrangements; assistance, participation, trust and external support; ownership, regulation, institutional capacity and administrative structure), which is also why pooling was rejected. No effect was converted to a common scale. Sensitivity analyses removed abstract-only and shallow extractions, linked reports and two coding judgment calls, and would remove the rows of studies not flagged eligible (none remain since S589’s row was taken out on 2026-10-14); they are reported as a supplementary table (</w:t>
       </w:r>
       <w:r>
         <w:rPr>
@@ -752,7 +752,7 @@
         <w:pStyle w:val="FirstParagraph"/>
       </w:pPr>
       <w:r>
-        <w:t xml:space="preserve">This is an AI-assisted systematic review. A large language model (Claude, Anthropic) performed most of the title/abstract first-pass screening, full-text screening, data extraction, risk-of-bias appraisal and synthesis drafting, under the direction of the human researcher, who defined the question, protocol and eligibility criteria, ran the database searches, supplied the full texts and made the closing and scoping decisions. Independent human verification was partial: a human second reviewer covered the 3,665 title/abstract records the AI marked include or unsure (not the AI’s exclusions), and confirmed 197 of the 1,080 full-text includes; no extracted value or risk-of-bias rating has been independently verified against source papers, and the researcher adjudicated 192 further full-text decisions (146 exclusions, 46 inclusions; open items A16, A19, A22 to A25 and A6), so 389 of the 2,277 full-text decisions (17.1%) carry human verification or adjudication, but the remaining AI full-text decisions have not been checked by a human. Model and tool provenance, as logged in the repository: Claude (Anthropic) made the title/abstract first-pass decisions (labels</w:t>
+        <w:t xml:space="preserve">This is an AI-assisted systematic review. A large language model (Claude, Anthropic) performed most of the title/abstract first-pass screening, full-text screening, data extraction, risk-of-bias appraisal and synthesis drafting, under the direction of the human researcher, who defined the question, protocol and eligibility criteria, ran the database searches, supplied the full texts and made the closing and scoping decisions. Independent human verification was partial: a human second reviewer covered the 3,665 title/abstract records the AI marked include or unsure (not the AI’s exclusions), and confirmed 197 of the 1,080 full-text includes; no extracted value or risk-of-bias rating has been independently verified against source papers, and the researcher adjudicated 214 further full-text decisions (146 exclusions, 68 inclusions; open items A16, A19, A22 to A25 and A6), so 411 of the 2,277 full-text decisions (18.1%) carry human verification or adjudication, but the remaining AI full-text decisions have not been checked by a human. Model and tool provenance, as logged in the repository: Claude (Anthropic) made the title/abstract first-pass decisions (labels</w:t>
       </w:r>
       <w:r>
         <w:t xml:space="preserve"> </w:t>
@@ -4532,7 +4532,7 @@
         <w:t xml:space="preserve"> </w:t>
       </w:r>
       <w:r>
-        <w:t xml:space="preserve">Screening decisions, extraction, appraisal and coding of direction of association were made by the same AI system; only 197 full-text includes were human-confirmed and 192 further decisions were adjudicated by the researcher, 73 decided rows had no reviewer recorded at the time (the label was inferred afterwards), and the title/abstract exclusions were not human-checked. A blind re-read by two non-Claude models (Codex, Gemini) of 70 of the AI’s full-text excludes (a stratified sample, limited to records whose PDF was available) judged 34 of them to be includes; this is an AI-versus-AI check, it was not human-adjudicated, and, scaled by exclusion code, the rate would imply roughly 532 further includes if the models were right, and an AI triage of the same records puts about 37 under a narrow reading of the criteria (arithmetic only), so the exclusion log may understate the eligible literature substantially; in the other direction, the models would exclude 3 of 40 sampled unconfirmed includes, roughly 66 of the unconfirmed includes if the rate held (open item A16;</w:t>
+        <w:t xml:space="preserve">Screening decisions, extraction, appraisal and coding of direction of association were made by the same AI system; only 197 full-text includes were human-confirmed and 214 further decisions were adjudicated by the researcher, 73 decided rows had no reviewer recorded at the time (the label was inferred afterwards), and the title/abstract exclusions were not human-checked. A blind re-read by two non-Claude models (Codex, Gemini) of 70 of the AI’s full-text excludes (a stratified sample, limited to records whose PDF was available) judged 34 of them to be includes; this is an AI-versus-AI check, it was not human-adjudicated, and, scaled by exclusion code, the rate would imply roughly 532 further includes if the models were right, and an AI triage of the same records puts about 37 under a narrow reading of the criteria (arithmetic only), so the exclusion log may understate the eligible literature substantially; in the other direction, the models would exclude 3 of 40 sampled unconfirmed includes, roughly 66 of the unconfirmed includes if the rate held (open item A16;</w:t>
       </w:r>
       <w:r>
         <w:t xml:space="preserve"> </w:t>

</xml_diff>